<commit_message>
updated my readme pdf
</commit_message>
<xml_diff>
--- a/ReadME.docx
+++ b/ReadME.docx
@@ -2542,19 +2542,30 @@
           <w:bCs w:val="0"/>
           <w:sz w:val="22"/>
           <w:szCs w:val="22"/>
-          <w:lang w:val="en-US"/>
-        </w:rPr>
-      </w:pPr>
-      <w:r>
-        <w:rPr>
-          <w:rFonts w:hint="default"/>
-          <w:b w:val="0"/>
-          <w:bCs w:val="0"/>
-          <w:sz w:val="22"/>
-          <w:szCs w:val="22"/>
-          <w:lang w:val="en-US"/>
-        </w:rPr>
-        <w:t>Week4-5:21-30 April -css styling ,used external css on my html structure ,added color,and styling layouts.</w:t>
+          <w:lang w:val="en-ZA"/>
+        </w:rPr>
+      </w:pPr>
+      <w:r>
+        <w:rPr>
+          <w:rFonts w:hint="default"/>
+          <w:b w:val="0"/>
+          <w:bCs w:val="0"/>
+          <w:sz w:val="22"/>
+          <w:szCs w:val="22"/>
+          <w:lang w:val="en-US"/>
+        </w:rPr>
+        <w:t>Week4-5:21-30 April -css styling ,used external css on my html structure ,added color,and styling layouts</w:t>
+      </w:r>
+      <w:r>
+        <w:rPr>
+          <w:rFonts w:hint="default"/>
+          <w:b w:val="0"/>
+          <w:bCs w:val="0"/>
+          <w:sz w:val="22"/>
+          <w:szCs w:val="22"/>
+          <w:lang w:val="en-ZA"/>
+        </w:rPr>
+        <w:t xml:space="preserve"> </w:t>
       </w:r>
     </w:p>
     <w:p>
@@ -2610,20 +2621,7 @@
           <w:szCs w:val="22"/>
           <w:lang w:val="en-US"/>
         </w:rPr>
-        <w:t>Week 7:debugging</w:t>
-      </w:r>
-      <w:bookmarkStart w:id="0" w:name="_GoBack"/>
-      <w:bookmarkEnd w:id="0"/>
-      <w:r>
-        <w:rPr>
-          <w:rFonts w:hint="default"/>
-          <w:b w:val="0"/>
-          <w:bCs w:val="0"/>
-          <w:sz w:val="22"/>
-          <w:szCs w:val="22"/>
-          <w:lang w:val="en-US"/>
-        </w:rPr>
-        <w:t xml:space="preserve"> ,testing and final submission.</w:t>
+        <w:t>Week 7:debugging ,testing and final submission.</w:t>
       </w:r>
     </w:p>
     <w:p>
@@ -2689,12 +2687,120 @@
     <w:p>
       <w:pPr>
         <w:numPr>
-          <w:ilvl w:val="0"/>
           <w:numId w:val="0"/>
         </w:numPr>
         <w:ind w:leftChars="0"/>
         <w:rPr>
           <w:rFonts w:hint="default"/>
+          <w:b/>
+          <w:bCs/>
+          <w:sz w:val="22"/>
+          <w:szCs w:val="22"/>
+          <w:lang w:val="en-US"/>
+        </w:rPr>
+      </w:pPr>
+    </w:p>
+    <w:p>
+      <w:pPr>
+        <w:numPr>
+          <w:numId w:val="0"/>
+        </w:numPr>
+        <w:ind w:leftChars="0"/>
+        <w:rPr>
+          <w:rFonts w:hint="default"/>
+          <w:b w:val="0"/>
+          <w:bCs w:val="0"/>
+          <w:sz w:val="22"/>
+          <w:szCs w:val="22"/>
+          <w:lang w:val="en-ZA"/>
+        </w:rPr>
+      </w:pPr>
+      <w:r>
+        <w:rPr>
+          <w:rFonts w:hint="default"/>
+          <w:b/>
+          <w:bCs/>
+          <w:sz w:val="22"/>
+          <w:szCs w:val="22"/>
+          <w:lang w:val="en-ZA"/>
+        </w:rPr>
+        <w:t>-</w:t>
+      </w:r>
+      <w:r>
+        <w:rPr>
+          <w:rFonts w:hint="default"/>
+          <w:b w:val="0"/>
+          <w:bCs w:val="0"/>
+          <w:sz w:val="22"/>
+          <w:szCs w:val="22"/>
+          <w:lang w:val="en-ZA"/>
+        </w:rPr>
+        <w:t>web development R5000</w:t>
+      </w:r>
+    </w:p>
+    <w:p>
+      <w:pPr>
+        <w:numPr>
+          <w:numId w:val="0"/>
+        </w:numPr>
+        <w:ind w:leftChars="0"/>
+        <w:rPr>
+          <w:rFonts w:hint="default"/>
+          <w:b w:val="0"/>
+          <w:bCs w:val="0"/>
+          <w:sz w:val="22"/>
+          <w:szCs w:val="22"/>
+          <w:lang w:val="en-ZA"/>
+        </w:rPr>
+      </w:pPr>
+      <w:r>
+        <w:rPr>
+          <w:rFonts w:hint="default"/>
+          <w:b w:val="0"/>
+          <w:bCs w:val="0"/>
+          <w:sz w:val="22"/>
+          <w:szCs w:val="22"/>
+          <w:lang w:val="en-ZA"/>
+        </w:rPr>
+        <w:t>-SSL certificate R1500 per year</w:t>
+      </w:r>
+    </w:p>
+    <w:p>
+      <w:pPr>
+        <w:numPr>
+          <w:numId w:val="0"/>
+        </w:numPr>
+        <w:ind w:leftChars="0"/>
+        <w:rPr>
+          <w:rFonts w:hint="default"/>
+          <w:b w:val="0"/>
+          <w:bCs w:val="0"/>
+          <w:sz w:val="22"/>
+          <w:szCs w:val="22"/>
+          <w:lang w:val="en-ZA"/>
+        </w:rPr>
+      </w:pPr>
+      <w:r>
+        <w:rPr>
+          <w:rFonts w:hint="default"/>
+          <w:b w:val="0"/>
+          <w:bCs w:val="0"/>
+          <w:sz w:val="22"/>
+          <w:szCs w:val="22"/>
+          <w:lang w:val="en-ZA"/>
+        </w:rPr>
+        <w:t>-maintenance R300 per month</w:t>
+      </w:r>
+    </w:p>
+    <w:p>
+      <w:pPr>
+        <w:numPr>
+          <w:ilvl w:val="0"/>
+          <w:numId w:val="0"/>
+        </w:numPr>
+        <w:ind w:leftChars="0"/>
+        <w:rPr>
+          <w:rFonts w:hint="default"/>
           <w:b w:val="0"/>
           <w:bCs w:val="0"/>
           <w:sz w:val="22"/>
@@ -2739,7 +2845,7 @@
           <w:szCs w:val="22"/>
           <w:lang w:val="en-ZA"/>
         </w:rPr>
-        <w:t>-Reliable shared hosting R800-R1 500 per year</w:t>
+        <w:t>-Reliable email hosting R400 per year</w:t>
       </w:r>
     </w:p>
     <w:p>
@@ -2817,7 +2923,7 @@
           <w:szCs w:val="22"/>
           <w:lang w:val="en-ZA"/>
         </w:rPr>
-        <w:t>-Fixes, updates and small improvements R500-R1 200</w:t>
+        <w:t>-Fixes, updates and small improvements R500</w:t>
       </w:r>
     </w:p>
     <w:p>
@@ -3103,6 +3209,849 @@
           <w:lang w:val="en-US"/>
         </w:rPr>
         <w:t>(n.d.). Custom cakes n NJ.Red Rose Bakery.Available at:https://redrosebakerynj.com/custom-birthday-cakes/[Accessed:April 09, 2026 ]</w:t>
+      </w:r>
+    </w:p>
+    <w:p>
+      <w:pPr>
+        <w:numPr>
+          <w:ilvl w:val="0"/>
+          <w:numId w:val="0"/>
+        </w:numPr>
+        <w:ind w:leftChars="0"/>
+        <w:rPr>
+          <w:rFonts w:hint="default"/>
+          <w:b w:val="0"/>
+          <w:bCs w:val="0"/>
+          <w:sz w:val="22"/>
+          <w:szCs w:val="22"/>
+          <w:lang w:val="en-US"/>
+        </w:rPr>
+      </w:pPr>
+    </w:p>
+    <w:p>
+      <w:pPr>
+        <w:numPr>
+          <w:ilvl w:val="0"/>
+          <w:numId w:val="0"/>
+        </w:numPr>
+        <w:ind w:leftChars="0"/>
+        <w:rPr>
+          <w:rFonts w:hint="default"/>
+          <w:b w:val="0"/>
+          <w:bCs w:val="0"/>
+          <w:sz w:val="22"/>
+          <w:szCs w:val="22"/>
+          <w:lang w:val="en-ZA"/>
+        </w:rPr>
+      </w:pPr>
+      <w:r>
+        <w:rPr>
+          <w:rFonts w:hint="default"/>
+          <w:b/>
+          <w:bCs/>
+          <w:sz w:val="22"/>
+          <w:szCs w:val="22"/>
+          <w:lang w:val="en-ZA"/>
+        </w:rPr>
+        <w:t>Cake Zone</w:t>
+      </w:r>
+      <w:r>
+        <w:rPr>
+          <w:rFonts w:hint="default"/>
+          <w:b w:val="0"/>
+          <w:bCs w:val="0"/>
+          <w:sz w:val="22"/>
+          <w:szCs w:val="22"/>
+          <w:lang w:val="en-ZA"/>
+        </w:rPr>
+        <w:t>(2026). Available at:www.cakezone.com(Accessed: 29 May 2026).</w:t>
+      </w:r>
+    </w:p>
+    <w:p>
+      <w:pPr>
+        <w:numPr>
+          <w:ilvl w:val="0"/>
+          <w:numId w:val="0"/>
+        </w:numPr>
+        <w:ind w:leftChars="0"/>
+        <w:rPr>
+          <w:rFonts w:hint="default"/>
+          <w:b w:val="0"/>
+          <w:bCs w:val="0"/>
+          <w:sz w:val="22"/>
+          <w:szCs w:val="22"/>
+          <w:lang w:val="en-ZA"/>
+        </w:rPr>
+      </w:pPr>
+    </w:p>
+    <w:p>
+      <w:pPr>
+        <w:rPr>
+          <w:rFonts w:hint="default"/>
+          <w:b w:val="0"/>
+          <w:bCs w:val="0"/>
+          <w:sz w:val="22"/>
+          <w:szCs w:val="22"/>
+          <w:lang w:val="en-ZA"/>
+        </w:rPr>
+      </w:pPr>
+      <w:r>
+        <w:rPr>
+          <w:rFonts w:hint="default"/>
+          <w:b/>
+          <w:bCs/>
+          <w:sz w:val="22"/>
+          <w:szCs w:val="22"/>
+          <w:lang w:val="en-ZA"/>
+        </w:rPr>
+        <w:t>Pinteres</w:t>
+      </w:r>
+      <w:r>
+        <w:rPr>
+          <w:rFonts w:hint="default"/>
+          <w:b w:val="0"/>
+          <w:bCs w:val="0"/>
+          <w:sz w:val="22"/>
+          <w:szCs w:val="22"/>
+          <w:lang w:val="en-ZA"/>
+        </w:rPr>
+        <w:t>t(2026)Cake pictures.Available at :https://www.pinterest.com(Accessed: 29 May 2026).</w:t>
+      </w:r>
+    </w:p>
+    <w:p>
+      <w:pPr>
+        <w:rPr>
+          <w:rFonts w:hint="default"/>
+          <w:b w:val="0"/>
+          <w:bCs w:val="0"/>
+          <w:sz w:val="22"/>
+          <w:szCs w:val="22"/>
+          <w:lang w:val="en-ZA"/>
+        </w:rPr>
+      </w:pPr>
+      <w:r>
+        <w:rPr>
+          <w:rFonts w:hint="default"/>
+          <w:b w:val="0"/>
+          <w:bCs w:val="0"/>
+          <w:sz w:val="22"/>
+          <w:szCs w:val="22"/>
+          <w:lang w:val="en-ZA"/>
+        </w:rPr>
+        <w:br w:type="page"/>
+      </w:r>
+    </w:p>
+    <w:p>
+      <w:pPr>
+        <w:numPr>
+          <w:ilvl w:val="0"/>
+          <w:numId w:val="0"/>
+        </w:numPr>
+        <w:ind w:leftChars="0"/>
+        <w:rPr>
+          <w:rFonts w:hint="default"/>
+          <w:b w:val="0"/>
+          <w:bCs w:val="0"/>
+          <w:sz w:val="22"/>
+          <w:szCs w:val="22"/>
+          <w:lang w:val="en-ZA"/>
+        </w:rPr>
+      </w:pPr>
+      <w:r>
+        <w:rPr>
+          <w:rFonts w:hint="default"/>
+          <w:b w:val="0"/>
+          <w:bCs w:val="0"/>
+          <w:sz w:val="22"/>
+          <w:szCs w:val="22"/>
+          <w:lang w:val="en-ZA"/>
+        </w:rPr>
+        <w:t>SCREENSHOTS EVIDENCE</w:t>
+      </w:r>
+    </w:p>
+    <w:p>
+      <w:pPr>
+        <w:numPr>
+          <w:ilvl w:val="0"/>
+          <w:numId w:val="0"/>
+        </w:numPr>
+        <w:ind w:leftChars="0"/>
+        <w:rPr>
+          <w:rFonts w:hint="default"/>
+          <w:b w:val="0"/>
+          <w:bCs w:val="0"/>
+          <w:sz w:val="22"/>
+          <w:szCs w:val="22"/>
+          <w:lang w:val="en-ZA"/>
+        </w:rPr>
+      </w:pPr>
+      <w:r>
+        <w:rPr>
+          <w:rFonts w:hint="default"/>
+          <w:b w:val="0"/>
+          <w:bCs w:val="0"/>
+          <w:sz w:val="22"/>
+          <w:szCs w:val="22"/>
+          <w:lang w:val="en-ZA"/>
+        </w:rPr>
+        <w:t>FROM DEVICE AND DESKTOP</w:t>
+      </w:r>
+      <w:bookmarkStart w:id="0" w:name="_GoBack"/>
+      <w:bookmarkEnd w:id="0"/>
+    </w:p>
+    <w:p>
+      <w:pPr>
+        <w:numPr>
+          <w:ilvl w:val="0"/>
+          <w:numId w:val="0"/>
+        </w:numPr>
+        <w:ind w:leftChars="0"/>
+        <w:rPr>
+          <w:rFonts w:hint="default"/>
+          <w:b w:val="0"/>
+          <w:bCs w:val="0"/>
+          <w:sz w:val="22"/>
+          <w:szCs w:val="22"/>
+          <w:lang w:val="en-ZA"/>
+        </w:rPr>
+      </w:pPr>
+    </w:p>
+    <w:p>
+      <w:pPr>
+        <w:numPr>
+          <w:ilvl w:val="0"/>
+          <w:numId w:val="0"/>
+        </w:numPr>
+        <w:ind w:leftChars="0"/>
+        <w:rPr>
+          <w:rFonts w:hint="default"/>
+          <w:b w:val="0"/>
+          <w:bCs w:val="0"/>
+          <w:sz w:val="22"/>
+          <w:szCs w:val="22"/>
+          <w:lang w:val="en-ZA"/>
+        </w:rPr>
+      </w:pPr>
+    </w:p>
+    <w:p>
+      <w:pPr>
+        <w:numPr>
+          <w:ilvl w:val="0"/>
+          <w:numId w:val="0"/>
+        </w:numPr>
+        <w:ind w:leftChars="0"/>
+        <w:rPr>
+          <w:rFonts w:hint="default"/>
+          <w:b w:val="0"/>
+          <w:bCs w:val="0"/>
+          <w:sz w:val="22"/>
+          <w:szCs w:val="22"/>
+          <w:lang w:val="en-ZA"/>
+        </w:rPr>
+      </w:pPr>
+      <w:r>
+        <w:rPr>
+          <w:rFonts w:hint="default"/>
+          <w:b w:val="0"/>
+          <w:bCs w:val="0"/>
+          <w:sz w:val="22"/>
+          <w:szCs w:val="22"/>
+          <w:lang w:val="en-ZA"/>
+        </w:rPr>
+        <w:drawing>
+          <wp:inline distT="0" distB="0" distL="114300" distR="114300">
+            <wp:extent cx="5266690" cy="2962910"/>
+            <wp:effectExtent l="0" t="0" r="6350" b="8890"/>
+            <wp:docPr id="15" name="Picture 15" descr="Screenshot 2026-05-29 195815"/>
+            <wp:cNvGraphicFramePr>
+              <a:graphicFrameLocks xmlns:a="http://schemas.openxmlformats.org/drawingml/2006/main" noChangeAspect="1"/>
+            </wp:cNvGraphicFramePr>
+            <a:graphic xmlns:a="http://schemas.openxmlformats.org/drawingml/2006/main">
+              <a:graphicData uri="http://schemas.openxmlformats.org/drawingml/2006/picture">
+                <pic:pic xmlns:pic="http://schemas.openxmlformats.org/drawingml/2006/picture">
+                  <pic:nvPicPr>
+                    <pic:cNvPr id="15" name="Picture 15" descr="Screenshot 2026-05-29 195815"/>
+                    <pic:cNvPicPr>
+                      <a:picLocks noChangeAspect="1"/>
+                    </pic:cNvPicPr>
+                  </pic:nvPicPr>
+                  <pic:blipFill>
+                    <a:blip r:embed="rId7"/>
+                    <a:stretch>
+                      <a:fillRect/>
+                    </a:stretch>
+                  </pic:blipFill>
+                  <pic:spPr>
+                    <a:xfrm>
+                      <a:off x="0" y="0"/>
+                      <a:ext cx="5266690" cy="2962910"/>
+                    </a:xfrm>
+                    <a:prstGeom prst="rect">
+                      <a:avLst/>
+                    </a:prstGeom>
+                  </pic:spPr>
+                </pic:pic>
+              </a:graphicData>
+            </a:graphic>
+          </wp:inline>
+        </w:drawing>
+      </w:r>
+      <w:r>
+        <w:rPr>
+          <w:rFonts w:hint="default"/>
+          <w:b w:val="0"/>
+          <w:bCs w:val="0"/>
+          <w:sz w:val="22"/>
+          <w:szCs w:val="22"/>
+          <w:lang w:val="en-ZA"/>
+        </w:rPr>
+        <w:drawing>
+          <wp:inline distT="0" distB="0" distL="114300" distR="114300">
+            <wp:extent cx="5266690" cy="2962910"/>
+            <wp:effectExtent l="0" t="0" r="6350" b="8890"/>
+            <wp:docPr id="14" name="Picture 14" descr="Screenshot 2026-05-29 195829"/>
+            <wp:cNvGraphicFramePr>
+              <a:graphicFrameLocks xmlns:a="http://schemas.openxmlformats.org/drawingml/2006/main" noChangeAspect="1"/>
+            </wp:cNvGraphicFramePr>
+            <a:graphic xmlns:a="http://schemas.openxmlformats.org/drawingml/2006/main">
+              <a:graphicData uri="http://schemas.openxmlformats.org/drawingml/2006/picture">
+                <pic:pic xmlns:pic="http://schemas.openxmlformats.org/drawingml/2006/picture">
+                  <pic:nvPicPr>
+                    <pic:cNvPr id="14" name="Picture 14" descr="Screenshot 2026-05-29 195829"/>
+                    <pic:cNvPicPr>
+                      <a:picLocks noChangeAspect="1"/>
+                    </pic:cNvPicPr>
+                  </pic:nvPicPr>
+                  <pic:blipFill>
+                    <a:blip r:embed="rId8"/>
+                    <a:stretch>
+                      <a:fillRect/>
+                    </a:stretch>
+                  </pic:blipFill>
+                  <pic:spPr>
+                    <a:xfrm>
+                      <a:off x="0" y="0"/>
+                      <a:ext cx="5266690" cy="2962910"/>
+                    </a:xfrm>
+                    <a:prstGeom prst="rect">
+                      <a:avLst/>
+                    </a:prstGeom>
+                  </pic:spPr>
+                </pic:pic>
+              </a:graphicData>
+            </a:graphic>
+          </wp:inline>
+        </w:drawing>
+      </w:r>
+      <w:r>
+        <w:rPr>
+          <w:rFonts w:hint="default"/>
+          <w:b w:val="0"/>
+          <w:bCs w:val="0"/>
+          <w:sz w:val="22"/>
+          <w:szCs w:val="22"/>
+          <w:lang w:val="en-ZA"/>
+        </w:rPr>
+        <w:drawing>
+          <wp:inline distT="0" distB="0" distL="114300" distR="114300">
+            <wp:extent cx="5266690" cy="2962910"/>
+            <wp:effectExtent l="0" t="0" r="6350" b="8890"/>
+            <wp:docPr id="13" name="Picture 13" descr="Screenshot 2026-05-29 195842"/>
+            <wp:cNvGraphicFramePr>
+              <a:graphicFrameLocks xmlns:a="http://schemas.openxmlformats.org/drawingml/2006/main" noChangeAspect="1"/>
+            </wp:cNvGraphicFramePr>
+            <a:graphic xmlns:a="http://schemas.openxmlformats.org/drawingml/2006/main">
+              <a:graphicData uri="http://schemas.openxmlformats.org/drawingml/2006/picture">
+                <pic:pic xmlns:pic="http://schemas.openxmlformats.org/drawingml/2006/picture">
+                  <pic:nvPicPr>
+                    <pic:cNvPr id="13" name="Picture 13" descr="Screenshot 2026-05-29 195842"/>
+                    <pic:cNvPicPr>
+                      <a:picLocks noChangeAspect="1"/>
+                    </pic:cNvPicPr>
+                  </pic:nvPicPr>
+                  <pic:blipFill>
+                    <a:blip r:embed="rId9"/>
+                    <a:stretch>
+                      <a:fillRect/>
+                    </a:stretch>
+                  </pic:blipFill>
+                  <pic:spPr>
+                    <a:xfrm>
+                      <a:off x="0" y="0"/>
+                      <a:ext cx="5266690" cy="2962910"/>
+                    </a:xfrm>
+                    <a:prstGeom prst="rect">
+                      <a:avLst/>
+                    </a:prstGeom>
+                  </pic:spPr>
+                </pic:pic>
+              </a:graphicData>
+            </a:graphic>
+          </wp:inline>
+        </w:drawing>
+      </w:r>
+      <w:r>
+        <w:rPr>
+          <w:rFonts w:hint="default"/>
+          <w:b w:val="0"/>
+          <w:bCs w:val="0"/>
+          <w:sz w:val="22"/>
+          <w:szCs w:val="22"/>
+          <w:lang w:val="en-ZA"/>
+        </w:rPr>
+        <w:drawing>
+          <wp:inline distT="0" distB="0" distL="114300" distR="114300">
+            <wp:extent cx="5266690" cy="2962910"/>
+            <wp:effectExtent l="0" t="0" r="6350" b="8890"/>
+            <wp:docPr id="12" name="Picture 12" descr="Screenshot 2026-05-29 195854"/>
+            <wp:cNvGraphicFramePr>
+              <a:graphicFrameLocks xmlns:a="http://schemas.openxmlformats.org/drawingml/2006/main" noChangeAspect="1"/>
+            </wp:cNvGraphicFramePr>
+            <a:graphic xmlns:a="http://schemas.openxmlformats.org/drawingml/2006/main">
+              <a:graphicData uri="http://schemas.openxmlformats.org/drawingml/2006/picture">
+                <pic:pic xmlns:pic="http://schemas.openxmlformats.org/drawingml/2006/picture">
+                  <pic:nvPicPr>
+                    <pic:cNvPr id="12" name="Picture 12" descr="Screenshot 2026-05-29 195854"/>
+                    <pic:cNvPicPr>
+                      <a:picLocks noChangeAspect="1"/>
+                    </pic:cNvPicPr>
+                  </pic:nvPicPr>
+                  <pic:blipFill>
+                    <a:blip r:embed="rId10"/>
+                    <a:stretch>
+                      <a:fillRect/>
+                    </a:stretch>
+                  </pic:blipFill>
+                  <pic:spPr>
+                    <a:xfrm>
+                      <a:off x="0" y="0"/>
+                      <a:ext cx="5266690" cy="2962910"/>
+                    </a:xfrm>
+                    <a:prstGeom prst="rect">
+                      <a:avLst/>
+                    </a:prstGeom>
+                  </pic:spPr>
+                </pic:pic>
+              </a:graphicData>
+            </a:graphic>
+          </wp:inline>
+        </w:drawing>
+      </w:r>
+      <w:r>
+        <w:rPr>
+          <w:rFonts w:hint="default"/>
+          <w:b w:val="0"/>
+          <w:bCs w:val="0"/>
+          <w:sz w:val="22"/>
+          <w:szCs w:val="22"/>
+          <w:lang w:val="en-ZA"/>
+        </w:rPr>
+        <w:drawing>
+          <wp:inline distT="0" distB="0" distL="114300" distR="114300">
+            <wp:extent cx="5266690" cy="2962910"/>
+            <wp:effectExtent l="0" t="0" r="6350" b="8890"/>
+            <wp:docPr id="11" name="Picture 11" descr="Screenshot 2026-05-29 195907"/>
+            <wp:cNvGraphicFramePr>
+              <a:graphicFrameLocks xmlns:a="http://schemas.openxmlformats.org/drawingml/2006/main" noChangeAspect="1"/>
+            </wp:cNvGraphicFramePr>
+            <a:graphic xmlns:a="http://schemas.openxmlformats.org/drawingml/2006/main">
+              <a:graphicData uri="http://schemas.openxmlformats.org/drawingml/2006/picture">
+                <pic:pic xmlns:pic="http://schemas.openxmlformats.org/drawingml/2006/picture">
+                  <pic:nvPicPr>
+                    <pic:cNvPr id="11" name="Picture 11" descr="Screenshot 2026-05-29 195907"/>
+                    <pic:cNvPicPr>
+                      <a:picLocks noChangeAspect="1"/>
+                    </pic:cNvPicPr>
+                  </pic:nvPicPr>
+                  <pic:blipFill>
+                    <a:blip r:embed="rId11"/>
+                    <a:stretch>
+                      <a:fillRect/>
+                    </a:stretch>
+                  </pic:blipFill>
+                  <pic:spPr>
+                    <a:xfrm>
+                      <a:off x="0" y="0"/>
+                      <a:ext cx="5266690" cy="2962910"/>
+                    </a:xfrm>
+                    <a:prstGeom prst="rect">
+                      <a:avLst/>
+                    </a:prstGeom>
+                  </pic:spPr>
+                </pic:pic>
+              </a:graphicData>
+            </a:graphic>
+          </wp:inline>
+        </w:drawing>
+      </w:r>
+      <w:r>
+        <w:rPr>
+          <w:rFonts w:hint="default"/>
+          <w:b w:val="0"/>
+          <w:bCs w:val="0"/>
+          <w:sz w:val="22"/>
+          <w:szCs w:val="22"/>
+          <w:lang w:val="en-ZA"/>
+        </w:rPr>
+        <w:drawing>
+          <wp:inline distT="0" distB="0" distL="114300" distR="114300">
+            <wp:extent cx="5266690" cy="2962910"/>
+            <wp:effectExtent l="0" t="0" r="6350" b="8890"/>
+            <wp:docPr id="10" name="Picture 10" descr="Screenshot 2026-05-29 195919"/>
+            <wp:cNvGraphicFramePr>
+              <a:graphicFrameLocks xmlns:a="http://schemas.openxmlformats.org/drawingml/2006/main" noChangeAspect="1"/>
+            </wp:cNvGraphicFramePr>
+            <a:graphic xmlns:a="http://schemas.openxmlformats.org/drawingml/2006/main">
+              <a:graphicData uri="http://schemas.openxmlformats.org/drawingml/2006/picture">
+                <pic:pic xmlns:pic="http://schemas.openxmlformats.org/drawingml/2006/picture">
+                  <pic:nvPicPr>
+                    <pic:cNvPr id="10" name="Picture 10" descr="Screenshot 2026-05-29 195919"/>
+                    <pic:cNvPicPr>
+                      <a:picLocks noChangeAspect="1"/>
+                    </pic:cNvPicPr>
+                  </pic:nvPicPr>
+                  <pic:blipFill>
+                    <a:blip r:embed="rId12"/>
+                    <a:stretch>
+                      <a:fillRect/>
+                    </a:stretch>
+                  </pic:blipFill>
+                  <pic:spPr>
+                    <a:xfrm>
+                      <a:off x="0" y="0"/>
+                      <a:ext cx="5266690" cy="2962910"/>
+                    </a:xfrm>
+                    <a:prstGeom prst="rect">
+                      <a:avLst/>
+                    </a:prstGeom>
+                  </pic:spPr>
+                </pic:pic>
+              </a:graphicData>
+            </a:graphic>
+          </wp:inline>
+        </w:drawing>
+      </w:r>
+    </w:p>
+    <w:p>
+      <w:pPr>
+        <w:numPr>
+          <w:ilvl w:val="0"/>
+          <w:numId w:val="0"/>
+        </w:numPr>
+        <w:ind w:leftChars="0"/>
+        <w:rPr>
+          <w:rFonts w:hint="default"/>
+          <w:b w:val="0"/>
+          <w:bCs w:val="0"/>
+          <w:sz w:val="22"/>
+          <w:szCs w:val="22"/>
+          <w:lang w:val="en-ZA"/>
+        </w:rPr>
+      </w:pPr>
+    </w:p>
+    <w:p>
+      <w:pPr>
+        <w:numPr>
+          <w:ilvl w:val="0"/>
+          <w:numId w:val="0"/>
+        </w:numPr>
+        <w:ind w:leftChars="0"/>
+        <w:rPr>
+          <w:rFonts w:hint="default"/>
+          <w:b w:val="0"/>
+          <w:bCs w:val="0"/>
+          <w:sz w:val="22"/>
+          <w:szCs w:val="22"/>
+          <w:lang w:val="en-ZA"/>
+        </w:rPr>
+      </w:pPr>
+      <w:r>
+        <w:rPr>
+          <w:rFonts w:hint="default"/>
+          <w:b w:val="0"/>
+          <w:bCs w:val="0"/>
+          <w:sz w:val="22"/>
+          <w:szCs w:val="22"/>
+          <w:lang w:val="en-ZA"/>
+        </w:rPr>
+        <w:drawing>
+          <wp:inline distT="0" distB="0" distL="114300" distR="114300">
+            <wp:extent cx="2517140" cy="2522220"/>
+            <wp:effectExtent l="0" t="0" r="0" b="0"/>
+            <wp:docPr id="9" name="Picture 9" descr="Screenshot 2026-05-29 195936"/>
+            <wp:cNvGraphicFramePr>
+              <a:graphicFrameLocks xmlns:a="http://schemas.openxmlformats.org/drawingml/2006/main" noChangeAspect="1"/>
+            </wp:cNvGraphicFramePr>
+            <a:graphic xmlns:a="http://schemas.openxmlformats.org/drawingml/2006/main">
+              <a:graphicData uri="http://schemas.openxmlformats.org/drawingml/2006/picture">
+                <pic:pic xmlns:pic="http://schemas.openxmlformats.org/drawingml/2006/picture">
+                  <pic:nvPicPr>
+                    <pic:cNvPr id="9" name="Picture 9" descr="Screenshot 2026-05-29 195936"/>
+                    <pic:cNvPicPr>
+                      <a:picLocks noChangeAspect="1"/>
+                    </pic:cNvPicPr>
+                  </pic:nvPicPr>
+                  <pic:blipFill>
+                    <a:blip r:embed="rId13"/>
+                    <a:srcRect l="50567" t="8958" r="1640" b="5915"/>
+                    <a:stretch>
+                      <a:fillRect/>
+                    </a:stretch>
+                  </pic:blipFill>
+                  <pic:spPr>
+                    <a:xfrm>
+                      <a:off x="0" y="0"/>
+                      <a:ext cx="2517140" cy="2522220"/>
+                    </a:xfrm>
+                    <a:prstGeom prst="rect">
+                      <a:avLst/>
+                    </a:prstGeom>
+                  </pic:spPr>
+                </pic:pic>
+              </a:graphicData>
+            </a:graphic>
+          </wp:inline>
+        </w:drawing>
+      </w:r>
+      <w:r>
+        <w:rPr>
+          <w:rFonts w:hint="default"/>
+          <w:b w:val="0"/>
+          <w:bCs w:val="0"/>
+          <w:sz w:val="22"/>
+          <w:szCs w:val="22"/>
+          <w:lang w:val="en-ZA"/>
+        </w:rPr>
+        <w:drawing>
+          <wp:inline distT="0" distB="0" distL="114300" distR="114300">
+            <wp:extent cx="2517140" cy="2512695"/>
+            <wp:effectExtent l="0" t="0" r="0" b="0"/>
+            <wp:docPr id="8" name="Picture 8" descr="Screenshot 2026-05-29 195948"/>
+            <wp:cNvGraphicFramePr>
+              <a:graphicFrameLocks xmlns:a="http://schemas.openxmlformats.org/drawingml/2006/main" noChangeAspect="1"/>
+            </wp:cNvGraphicFramePr>
+            <a:graphic xmlns:a="http://schemas.openxmlformats.org/drawingml/2006/main">
+              <a:graphicData uri="http://schemas.openxmlformats.org/drawingml/2006/picture">
+                <pic:pic xmlns:pic="http://schemas.openxmlformats.org/drawingml/2006/picture">
+                  <pic:nvPicPr>
+                    <pic:cNvPr id="8" name="Picture 8" descr="Screenshot 2026-05-29 195948"/>
+                    <pic:cNvPicPr>
+                      <a:picLocks noChangeAspect="1"/>
+                    </pic:cNvPicPr>
+                  </pic:nvPicPr>
+                  <pic:blipFill>
+                    <a:blip r:embed="rId14"/>
+                    <a:srcRect l="49602" t="8808" r="2604" b="6387"/>
+                    <a:stretch>
+                      <a:fillRect/>
+                    </a:stretch>
+                  </pic:blipFill>
+                  <pic:spPr>
+                    <a:xfrm>
+                      <a:off x="0" y="0"/>
+                      <a:ext cx="2517140" cy="2512695"/>
+                    </a:xfrm>
+                    <a:prstGeom prst="rect">
+                      <a:avLst/>
+                    </a:prstGeom>
+                  </pic:spPr>
+                </pic:pic>
+              </a:graphicData>
+            </a:graphic>
+          </wp:inline>
+        </w:drawing>
+      </w:r>
+      <w:r>
+        <w:rPr>
+          <w:rFonts w:hint="default"/>
+          <w:b w:val="0"/>
+          <w:bCs w:val="0"/>
+          <w:sz w:val="22"/>
+          <w:szCs w:val="22"/>
+          <w:lang w:val="en-ZA"/>
+        </w:rPr>
+        <w:drawing>
+          <wp:inline distT="0" distB="0" distL="114300" distR="114300">
+            <wp:extent cx="2560955" cy="2519680"/>
+            <wp:effectExtent l="0" t="0" r="0" b="0"/>
+            <wp:docPr id="7" name="Picture 7" descr="Screenshot 2026-05-29 200004"/>
+            <wp:cNvGraphicFramePr>
+              <a:graphicFrameLocks xmlns:a="http://schemas.openxmlformats.org/drawingml/2006/main" noChangeAspect="1"/>
+            </wp:cNvGraphicFramePr>
+            <a:graphic xmlns:a="http://schemas.openxmlformats.org/drawingml/2006/main">
+              <a:graphicData uri="http://schemas.openxmlformats.org/drawingml/2006/picture">
+                <pic:pic xmlns:pic="http://schemas.openxmlformats.org/drawingml/2006/picture">
+                  <pic:nvPicPr>
+                    <pic:cNvPr id="7" name="Picture 7" descr="Screenshot 2026-05-29 200004"/>
+                    <pic:cNvPicPr>
+                      <a:picLocks noChangeAspect="1"/>
+                    </pic:cNvPicPr>
+                  </pic:nvPicPr>
+                  <pic:blipFill>
+                    <a:blip r:embed="rId15"/>
+                    <a:srcRect t="9130" r="51374" b="5829"/>
+                    <a:stretch>
+                      <a:fillRect/>
+                    </a:stretch>
+                  </pic:blipFill>
+                  <pic:spPr>
+                    <a:xfrm>
+                      <a:off x="0" y="0"/>
+                      <a:ext cx="2560955" cy="2519680"/>
+                    </a:xfrm>
+                    <a:prstGeom prst="rect">
+                      <a:avLst/>
+                    </a:prstGeom>
+                  </pic:spPr>
+                </pic:pic>
+              </a:graphicData>
+            </a:graphic>
+          </wp:inline>
+        </w:drawing>
+      </w:r>
+      <w:r>
+        <w:rPr>
+          <w:rFonts w:hint="default"/>
+          <w:b w:val="0"/>
+          <w:bCs w:val="0"/>
+          <w:sz w:val="22"/>
+          <w:szCs w:val="22"/>
+          <w:lang w:val="en-ZA"/>
+        </w:rPr>
+        <w:drawing>
+          <wp:inline distT="0" distB="0" distL="114300" distR="114300">
+            <wp:extent cx="2539365" cy="2545080"/>
+            <wp:effectExtent l="0" t="0" r="0" b="0"/>
+            <wp:docPr id="6" name="Picture 6" descr="Screenshot 2026-05-29 200012"/>
+            <wp:cNvGraphicFramePr>
+              <a:graphicFrameLocks xmlns:a="http://schemas.openxmlformats.org/drawingml/2006/main" noChangeAspect="1"/>
+            </wp:cNvGraphicFramePr>
+            <a:graphic xmlns:a="http://schemas.openxmlformats.org/drawingml/2006/main">
+              <a:graphicData uri="http://schemas.openxmlformats.org/drawingml/2006/picture">
+                <pic:pic xmlns:pic="http://schemas.openxmlformats.org/drawingml/2006/picture">
+                  <pic:nvPicPr>
+                    <pic:cNvPr id="6" name="Picture 6" descr="Screenshot 2026-05-29 200012"/>
+                    <pic:cNvPicPr>
+                      <a:picLocks noChangeAspect="1"/>
+                    </pic:cNvPicPr>
+                  </pic:nvPicPr>
+                  <pic:blipFill>
+                    <a:blip r:embed="rId16"/>
+                    <a:srcRect l="977" t="9001" r="50808" b="5101"/>
+                    <a:stretch>
+                      <a:fillRect/>
+                    </a:stretch>
+                  </pic:blipFill>
+                  <pic:spPr>
+                    <a:xfrm>
+                      <a:off x="0" y="0"/>
+                      <a:ext cx="2539365" cy="2545080"/>
+                    </a:xfrm>
+                    <a:prstGeom prst="rect">
+                      <a:avLst/>
+                    </a:prstGeom>
+                  </pic:spPr>
+                </pic:pic>
+              </a:graphicData>
+            </a:graphic>
+          </wp:inline>
+        </w:drawing>
+      </w:r>
+      <w:r>
+        <w:rPr>
+          <w:rFonts w:hint="default"/>
+          <w:b w:val="0"/>
+          <w:bCs w:val="0"/>
+          <w:sz w:val="22"/>
+          <w:szCs w:val="22"/>
+          <w:lang w:val="en-ZA"/>
+        </w:rPr>
+        <w:drawing>
+          <wp:inline distT="0" distB="0" distL="114300" distR="114300">
+            <wp:extent cx="2510155" cy="2520315"/>
+            <wp:effectExtent l="0" t="0" r="0" b="0"/>
+            <wp:docPr id="5" name="Picture 5" descr="Screenshot 2026-05-29 200022"/>
+            <wp:cNvGraphicFramePr>
+              <a:graphicFrameLocks xmlns:a="http://schemas.openxmlformats.org/drawingml/2006/main" noChangeAspect="1"/>
+            </wp:cNvGraphicFramePr>
+            <a:graphic xmlns:a="http://schemas.openxmlformats.org/drawingml/2006/main">
+              <a:graphicData uri="http://schemas.openxmlformats.org/drawingml/2006/picture">
+                <pic:pic xmlns:pic="http://schemas.openxmlformats.org/drawingml/2006/picture">
+                  <pic:nvPicPr>
+                    <pic:cNvPr id="5" name="Picture 5" descr="Screenshot 2026-05-29 200022"/>
+                    <pic:cNvPicPr>
+                      <a:picLocks noChangeAspect="1"/>
+                    </pic:cNvPicPr>
+                  </pic:nvPicPr>
+                  <pic:blipFill>
+                    <a:blip r:embed="rId17"/>
+                    <a:srcRect l="422" t="8830" r="51917" b="6108"/>
+                    <a:stretch>
+                      <a:fillRect/>
+                    </a:stretch>
+                  </pic:blipFill>
+                  <pic:spPr>
+                    <a:xfrm>
+                      <a:off x="0" y="0"/>
+                      <a:ext cx="2510155" cy="2520315"/>
+                    </a:xfrm>
+                    <a:prstGeom prst="rect">
+                      <a:avLst/>
+                    </a:prstGeom>
+                  </pic:spPr>
+                </pic:pic>
+              </a:graphicData>
+            </a:graphic>
+          </wp:inline>
+        </w:drawing>
+      </w:r>
+      <w:r>
+        <w:rPr>
+          <w:rFonts w:hint="default"/>
+          <w:b w:val="0"/>
+          <w:bCs w:val="0"/>
+          <w:sz w:val="22"/>
+          <w:szCs w:val="22"/>
+          <w:lang w:val="en-ZA"/>
+        </w:rPr>
+        <w:drawing>
+          <wp:inline distT="0" distB="0" distL="114300" distR="114300">
+            <wp:extent cx="2620010" cy="2542540"/>
+            <wp:effectExtent l="0" t="0" r="0" b="0"/>
+            <wp:docPr id="4" name="Picture 4" descr="Screenshot 2026-05-29 200037"/>
+            <wp:cNvGraphicFramePr>
+              <a:graphicFrameLocks xmlns:a="http://schemas.openxmlformats.org/drawingml/2006/main" noChangeAspect="1"/>
+            </wp:cNvGraphicFramePr>
+            <a:graphic xmlns:a="http://schemas.openxmlformats.org/drawingml/2006/main">
+              <a:graphicData uri="http://schemas.openxmlformats.org/drawingml/2006/picture">
+                <pic:pic xmlns:pic="http://schemas.openxmlformats.org/drawingml/2006/picture">
+                  <pic:nvPicPr>
+                    <pic:cNvPr id="4" name="Picture 4" descr="Screenshot 2026-05-29 200037"/>
+                    <pic:cNvPicPr>
+                      <a:picLocks noChangeAspect="1"/>
+                    </pic:cNvPicPr>
+                  </pic:nvPicPr>
+                  <pic:blipFill>
+                    <a:blip r:embed="rId18"/>
+                    <a:srcRect t="8423" r="50253" b="5765"/>
+                    <a:stretch>
+                      <a:fillRect/>
+                    </a:stretch>
+                  </pic:blipFill>
+                  <pic:spPr>
+                    <a:xfrm>
+                      <a:off x="0" y="0"/>
+                      <a:ext cx="2620010" cy="2542540"/>
+                    </a:xfrm>
+                    <a:prstGeom prst="rect">
+                      <a:avLst/>
+                    </a:prstGeom>
+                  </pic:spPr>
+                </pic:pic>
+              </a:graphicData>
+            </a:graphic>
+          </wp:inline>
+        </w:drawing>
       </w:r>
     </w:p>
     <w:sectPr>

</xml_diff>